<commit_message>
add Pulse in experiences
</commit_message>
<xml_diff>
--- a/public/CV/finale Curriculum Vitae - LOVA.docx
+++ b/public/CV/finale Curriculum Vitae - LOVA.docx
@@ -1180,16 +1180,7 @@
           <w:color w:val="585858"/>
           <w:sz w:val="24"/>
         </w:rPr>
-        <w:t>nouveaux outils et technologies. Attentif aux détails, autonome et engagé à produire un code propre, maintenable, tout en respectant les délais des projets. Désireux de contribuer à des projets innovants et de se développer professionnellement dans le domaine dynamique du dévelop</w:t>
-      </w:r>
-      <w:bookmarkStart w:id="21" w:name="_GoBack"/>
-      <w:bookmarkEnd w:id="21"/>
-      <w:r>
-        <w:rPr>
-          <w:color w:val="585858"/>
-          <w:sz w:val="24"/>
-        </w:rPr>
-        <w:t>pement web.</w:t>
+        <w:t>nouveaux outils et technologies. Attentif aux détails, autonome et engagé à produire un code propre, maintenable, tout en respectant les délais des projets. Désireux de contribuer à des projets innovants et de se développer professionnellement dans le domaine dynamique du développement web.</w:t>
       </w:r>
     </w:p>
     <w:p>
@@ -1253,7 +1244,7 @@
           <w:sz w:val="24"/>
           <w:lang w:val="fr-FR"/>
         </w:rPr>
-        <w:t xml:space="preserve">Avril </w:t>
+        <w:t xml:space="preserve">AVRIL </w:t>
       </w:r>
       <w:r>
         <w:rPr>
@@ -1302,8 +1293,10 @@
           <w:sz w:val="24"/>
           <w:lang w:val="fr-FR"/>
         </w:rPr>
-        <w:t>Present</w:t>
-      </w:r>
+        <w:t>PRESENT</w:t>
+      </w:r>
+      <w:bookmarkStart w:id="21" w:name="_GoBack"/>
+      <w:bookmarkEnd w:id="21"/>
     </w:p>
     <w:p>
       <w:pPr>
@@ -3728,7 +3721,7 @@
           <w:sz w:val="24"/>
           <w:lang w:val="fr-FR"/>
         </w:rPr>
-        <w:t>, GRAV</w:t>
+        <w:t>, GRAV, Wordpress</w:t>
       </w:r>
     </w:p>
     <w:p>

</xml_diff>